<commit_message>
feat(paper): 引用转为 MDPI 数字格式
- scripts/convert_citations.py：按首次出现顺序统一编号（叙述式与方括号一起扫）
- 25 条文献全部重排为数字列表，正文引用变为 [n] / [n,m]
- 修正组合引用（Jiang H. 2023/2024 → 两个编号）
- 英文 Word 重新生成，另存桌面 v2
</commit_message>
<xml_diff>
--- a/docs/paper-en.docx
+++ b/docs/paper-en.docx
@@ -201,7 +201,7 @@
     </w:p>
     <w:p>
       <w:r>
-        <w:t>external, updatable evidence [Lewis et al., 2020]. In most systems the retrieval depth is a</w:t>
+        <w:t>external, updatable evidence [1]. In most systems the retrieval depth is a</w:t>
       </w:r>
     </w:p>
     <w:p>
@@ -211,7 +211,7 @@
     </w:p>
     <w:p>
       <w:r>
-        <w:t>[Robertson and Zaragoza, 2009; Karpukhin et al., 2020]. That default made sense when context</w:t>
+        <w:t>[2,3]. That default made sense when context</w:t>
       </w:r>
     </w:p>
     <w:p>
@@ -226,7 +226,7 @@
     </w:p>
     <w:p>
       <w:r>
-        <w:t>where the same evidence lands in the context [Liu et al., 2024], so "retrieve more" is no</w:t>
+        <w:t>where the same evidence lands in the context [4], so "retrieve more" is no</w:t>
       </w:r>
     </w:p>
     <w:p>
@@ -519,17 +519,12 @@
     </w:p>
     <w:p>
       <w:r>
-        <w:t>[Lewis et al., 2020], and in most systems the retrieval depth is a hyperparameter: a fixed number</w:t>
-      </w:r>
-    </w:p>
-    <w:p>
-      <w:r>
-        <w:t>of top-$k$ passages is retrieved and concatenated into the context [Robertson and Zaragoza, 2009;</w:t>
-      </w:r>
-    </w:p>
-    <w:p>
-      <w:r>
-        <w:t>Karpukhin et al., 2020]. That default was reasonable when context was cheap—taking a few more</w:t>
+        <w:t>[1], and in most systems the retrieval depth is a hyperparameter: a fixed number</w:t>
+      </w:r>
+    </w:p>
+    <w:p>
+      <w:r>
+        <w:t>of top-$k$ passages is retrieved and concatenated into the context [2,3]. That default was reasonable when context was cheap—taking a few more</w:t>
       </w:r>
     </w:p>
     <w:p>
@@ -539,7 +534,7 @@
     </w:p>
     <w:p>
       <w:r>
-        <w:t>double-digit accuracy differences depending on where the same evidence lands [Liu et al., 2024], so</w:t>
+        <w:t>double-digit accuracy differences depending on where the same evidence lands [4], so</w:t>
       </w:r>
     </w:p>
     <w:p>
@@ -618,7 +613,7 @@
         <w:t>FLARE</w:t>
       </w:r>
       <w:r>
-        <w:t xml:space="preserve"> [Jiang Z. et al., 2023] ties "when to retrieve" to the generation process: when a</w:t>
+        <w:t xml:space="preserve"> [5] ties "when to retrieve" to the generation process: when a</w:t>
       </w:r>
     </w:p>
     <w:p>
@@ -637,7 +632,7 @@
         <w:t>Self-RAG</w:t>
       </w:r>
       <w:r>
-        <w:t xml:space="preserve"> [Asai et al., 2024] goes further and</w:t>
+        <w:t xml:space="preserve"> [6] goes further and</w:t>
       </w:r>
     </w:p>
     <w:p>
@@ -661,7 +656,7 @@
         <w:t>SKR</w:t>
       </w:r>
       <w:r>
-        <w:t xml:space="preserve"> [Wang et al., 2023] takes a lower-effort route: it labels questions by</w:t>
+        <w:t xml:space="preserve"> [7] takes a lower-effort route: it labels questions by</w:t>
       </w:r>
     </w:p>
     <w:p>
@@ -690,7 +685,7 @@
         <w:t>Adaptive-RAG</w:t>
       </w:r>
       <w:r>
-        <w:t xml:space="preserve"> [Jeong et al., 2024] trains a query</w:t>
+        <w:t xml:space="preserve"> [8] trains a query</w:t>
       </w:r>
     </w:p>
     <w:p>
@@ -709,7 +704,7 @@
         <w:t>Self-Ask</w:t>
       </w:r>
       <w:r>
-        <w:t xml:space="preserve"> [Press et al., 2023] decomposes composite questions into sub-questions that</w:t>
+        <w:t xml:space="preserve"> [9] decomposes composite questions into sub-questions that</w:t>
       </w:r>
     </w:p>
     <w:p>
@@ -723,7 +718,7 @@
         <w:t>IRCoT</w:t>
       </w:r>
       <w:r>
-        <w:t xml:space="preserve"> [Trivedi et al., 2023] interleaves chain-of-thought with</w:t>
+        <w:t xml:space="preserve"> [10] interleaves chain-of-thought with</w:t>
       </w:r>
     </w:p>
     <w:p>
@@ -812,7 +807,7 @@
         <w:t>CRAG</w:t>
       </w:r>
       <w:r>
-        <w:t xml:space="preserve"> [Yan et al., 2024] inserts a lightweight retrieval evaluator between retrieval and</w:t>
+        <w:t xml:space="preserve"> [11] inserts a lightweight retrieval evaluator between retrieval and</w:t>
       </w:r>
     </w:p>
     <w:p>
@@ -900,7 +895,7 @@
     </w:p>
     <w:p>
       <w:r>
-        <w:t>budgets do not reliably improve quality [Wu et al., 2026], which argues for modelling the allocation</w:t>
+        <w:t>budgets do not reliably improve quality [12], which argues for modelling the allocation</w:t>
       </w:r>
     </w:p>
     <w:p>
@@ -929,7 +924,7 @@
     </w:p>
     <w:p>
       <w:r>
-        <w:t>[Liu et al., 2024]. This explains why fixed top-$k$ misses at both ends: too much for easy</w:t>
+        <w:t>[4]. This explains why fixed top-$k$ misses at both ends: too much for easy</w:t>
       </w:r>
     </w:p>
     <w:p>
@@ -976,7 +971,7 @@
         <w:t>LLMLingua</w:t>
       </w:r>
       <w:r>
-        <w:t xml:space="preserve"> [Jiang H. et al., 2023] uses a</w:t>
+        <w:t xml:space="preserve"> [13] uses a</w:t>
       </w:r>
     </w:p>
     <w:p>
@@ -992,7 +987,7 @@
     </w:p>
     <w:p>
       <w:r>
-        <w:t>[Jiang H. et al., 2024] adds question-aware compression to reduce information loss on long documents;</w:t>
+        <w:t>[14] adds question-aware compression to reduce information loss on long documents;</w:t>
       </w:r>
     </w:p>
     <w:p>
@@ -1003,7 +998,7 @@
         <w:t>RECOMP</w:t>
       </w:r>
       <w:r>
-        <w:t xml:space="preserve"> [Xu et al., 2024] trains extractive and generative compressors that turn multiple passages</w:t>
+        <w:t xml:space="preserve"> [15] trains extractive and generative compressors that turn multiple passages</w:t>
       </w:r>
     </w:p>
     <w:p>
@@ -1027,7 +1022,7 @@
         <w:t>monoT5</w:t>
       </w:r>
       <w:r>
-        <w:t xml:space="preserve"> [Nogueira et al., 2020] casts</w:t>
+        <w:t xml:space="preserve"> [16] casts</w:t>
       </w:r>
     </w:p>
     <w:p>
@@ -1041,7 +1036,7 @@
         <w:t>RankGPT</w:t>
       </w:r>
       <w:r>
-        <w:t xml:space="preserve"> [Sun et al., 2023] uses a large model for</w:t>
+        <w:t xml:space="preserve"> [17] uses a large model for</w:t>
       </w:r>
     </w:p>
     <w:p>
@@ -1065,7 +1060,7 @@
         <w:t>HyDE</w:t>
       </w:r>
       <w:r>
-        <w:t xml:space="preserve"> [Gao et al., 2023] replaces the query with a generated pseudo-document</w:t>
+        <w:t xml:space="preserve"> [18] replaces the query with a generated pseudo-document</w:t>
       </w:r>
     </w:p>
     <w:p>
@@ -1079,7 +1074,7 @@
         <w:t>Rewrite-Retrieve-Read</w:t>
       </w:r>
       <w:r>
-        <w:t xml:space="preserve"> [Ma et al., 2023] places a rewriter before the</w:t>
+        <w:t xml:space="preserve"> [19] places a rewriter before the</w:t>
       </w:r>
     </w:p>
     <w:p>
@@ -1166,12 +1161,12 @@
         <w:t>MMR</w:t>
       </w:r>
       <w:r>
-        <w:t xml:space="preserve"> [Carbonell and Goldstein, 1998] subtracts similarity to already-selected</w:t>
-      </w:r>
-    </w:p>
-    <w:p>
-      <w:r>
-        <w:t>items from relevance and selects greedily one at a time, while Lin and Bilmes [2011] write coverage</w:t>
+        <w:t xml:space="preserve"> [20] subtracts similarity to already-selected</w:t>
+      </w:r>
+    </w:p>
+    <w:p>
+      <w:r>
+        <w:t>items from relevance and selects greedily one at a time, while Lin and Bilmes [21] write coverage</w:t>
       </w:r>
     </w:p>
     <w:p>
@@ -1181,7 +1176,7 @@
     </w:p>
     <w:p>
       <w:r>
-        <w:t>approximation bound comes from Nemhauser et al. [1978]: for a monotone submodular function under a</w:t>
+        <w:t>approximation bound comes from Nemhauser et al. [22]: for a monotone submodular function under a</w:t>
       </w:r>
     </w:p>
     <w:p>
@@ -1196,7 +1191,7 @@
     </w:p>
     <w:p>
       <w:r>
-        <w:t>Khuller et al. [1999] adds local enumeration across tiers and restores $1-1/e$ for the budgeted case.</w:t>
+        <w:t>Khuller et al. [23] adds local enumeration across tiers and restores $1-1/e$ for the budgeted case.</w:t>
       </w:r>
     </w:p>
     <w:p>
@@ -1221,7 +1216,7 @@
     </w:p>
     <w:p>
       <w:r>
-        <w:t>stop when the observation is good enough, continue otherwise [Wald, 1947]. The form was rediscovered</w:t>
+        <w:t>stop when the observation is good enough, continue otherwise [24]. The form was rediscovered</w:t>
       </w:r>
     </w:p>
     <w:p>
@@ -1235,7 +1230,7 @@
         <w:t>FrugalGPT</w:t>
       </w:r>
       <w:r>
-        <w:t xml:space="preserve"> [Chen et al., 2023] answers with a cheap model first and decides by</w:t>
+        <w:t xml:space="preserve"> [25] answers with a cheap model first and decides by</w:t>
       </w:r>
     </w:p>
     <w:p>
@@ -1441,7 +1436,7 @@
               <w:rPr>
                 <w:sz w:val="18"/>
               </w:rPr>
-              <w:t>Adaptive and multi-hop [Jiang Z. 2023; Asai 2024; Jeong 2024; Press 2023; Trivedi 2023]</w:t>
+              <w:t>Adaptive and multi-hop [5,6,8,9,10]</w:t>
             </w:r>
           </w:p>
         </w:tc>
@@ -1533,7 +1528,7 @@
               <w:rPr>
                 <w:sz w:val="18"/>
               </w:rPr>
-              <w:t>Corrective [Yan 2024]</w:t>
+              <w:t>Corrective [11]</w:t>
             </w:r>
           </w:p>
         </w:tc>
@@ -1625,7 +1620,7 @@
               <w:rPr>
                 <w:sz w:val="18"/>
               </w:rPr>
-              <w:t>Cost-aware [Wu 2026]</w:t>
+              <w:t>Cost-aware [12]</w:t>
             </w:r>
           </w:p>
         </w:tc>
@@ -1717,7 +1712,7 @@
               <w:rPr>
                 <w:sz w:val="18"/>
               </w:rPr>
-              <w:t>Compression and reranking [Jiang H. 2023/2024; Xu 2024; Nogueira 2020; Sun 2023]</w:t>
+              <w:t>Compression and reranking [13,14,15,16,17]</w:t>
             </w:r>
           </w:p>
         </w:tc>
@@ -1809,7 +1804,7 @@
               <w:rPr>
                 <w:sz w:val="18"/>
               </w:rPr>
-              <w:t>Submodular selection [Carbonell and Goldstein 1998; Nemhauser 1978; Khuller 1999]</w:t>
+              <w:t>Submodular selection [20,22,23]</w:t>
             </w:r>
           </w:p>
         </w:tc>
@@ -1901,7 +1896,7 @@
               <w:rPr>
                 <w:sz w:val="18"/>
               </w:rPr>
-              <w:t>Cascades and thresholds [Wald 1947; Chen 2023]</w:t>
+              <w:t>Cascades and thresholds [24,25]</w:t>
             </w:r>
           </w:p>
         </w:tc>
@@ -2434,7 +2429,7 @@
     </w:p>
     <w:p>
       <w:r>
-        <w:t>cardinality constraint [Nemhauser et al., 1978]; under a budget constraint the bound of</w:t>
+        <w:t>cardinality constraint [22]; under a budget constraint the bound of</w:t>
       </w:r>
     </w:p>
     <w:p>
@@ -2444,7 +2439,7 @@
     </w:p>
     <w:p>
       <w:r>
-        <w:t>[Khuller et al., 1999]. We instantiate this ordering on the retrieval action set; the gap to the</w:t>
+        <w:t>[23]. We instantiate this ordering on the retrieval action set; the gap to the</w:t>
       </w:r>
     </w:p>
     <w:p>
@@ -5976,7 +5971,95 @@
     </w:p>
     <w:p>
       <w:pPr>
-        <w:pStyle w:val="ListBullet"/>
+        <w:pStyle w:val="ListNumber"/>
+      </w:pPr>
+      <w:r>
+        <w:rPr>
+          <w:b/>
+        </w:rPr>
+        <w:t>Lewis, P.; Perez, E.; Piktus, A.; Petroni, F.; Karpukhin, V.; Goyal, N.; Küttler, H.; Lewis, M.; Yih, W.-t.; Rocktäschel, T.; Riedel, S.; Kiela, D.</w:t>
+      </w:r>
+      <w:r>
+        <w:t xml:space="preserve"> Retrieval-Augmented Generation for Knowledge-Intensive NLP Tasks. In *NeurIPS 2020*. arXiv:2005.11401.</w:t>
+      </w:r>
+    </w:p>
+    <w:p>
+      <w:pPr>
+        <w:pStyle w:val="ListNumber"/>
+      </w:pPr>
+      <w:r>
+        <w:rPr>
+          <w:b/>
+        </w:rPr>
+        <w:t>Robertson, S.; Zaragoza, H.</w:t>
+      </w:r>
+      <w:r>
+        <w:t xml:space="preserve"> The Probabilistic Relevance Framework: BM25 and Beyond. *Foundations and Trends in Information Retrieval* </w:t>
+      </w:r>
+      <w:r>
+        <w:rPr>
+          <w:b/>
+        </w:rPr>
+        <w:t>2009</w:t>
+      </w:r>
+      <w:r>
+        <w:t>, 3(4), 333–389.</w:t>
+      </w:r>
+    </w:p>
+    <w:p>
+      <w:pPr>
+        <w:pStyle w:val="ListNumber"/>
+      </w:pPr>
+      <w:r>
+        <w:rPr>
+          <w:b/>
+        </w:rPr>
+        <w:t>Karpukhin, V.; Oğuz, B.; Min, S.; Lewis, P.; Wu, L.; Edunov, S.; Chen, D.; Yih, W.-t.</w:t>
+      </w:r>
+      <w:r>
+        <w:t xml:space="preserve"> Dense Passage Retrieval for Open-Domain Question Answering. In *EMNLP 2020*. arXiv:2004.04906.</w:t>
+      </w:r>
+    </w:p>
+    <w:p>
+      <w:pPr>
+        <w:pStyle w:val="ListNumber"/>
+      </w:pPr>
+      <w:r>
+        <w:rPr>
+          <w:b/>
+        </w:rPr>
+        <w:t>Liu, N. F.; Lin, K.; Hewitt, J.; Paranjape, A.; Bevilacqua, M.; Petroni, F.; Liang, P.</w:t>
+      </w:r>
+      <w:r>
+        <w:t xml:space="preserve"> Lost in the Middle: How Language Models Use Long Contexts. *TACL* </w:t>
+      </w:r>
+      <w:r>
+        <w:rPr>
+          <w:b/>
+        </w:rPr>
+        <w:t>2024</w:t>
+      </w:r>
+      <w:r>
+        <w:t>, 12, 157–173. arXiv:2307.03172.</w:t>
+      </w:r>
+    </w:p>
+    <w:p>
+      <w:pPr>
+        <w:pStyle w:val="ListNumber"/>
+      </w:pPr>
+      <w:r>
+        <w:rPr>
+          <w:b/>
+        </w:rPr>
+        <w:t>Jiang, Z.; Xu, F. F.; Gao, L.; Sun, Z.; Liu, Q.; Dwivedi-Yu, J.; Yang, Y.; Callan, J.; Neubig, G.</w:t>
+      </w:r>
+      <w:r>
+        <w:t xml:space="preserve"> Active Retrieval Augmented Generation (FLARE). In *EMNLP 2023*. arXiv:2305.06983.</w:t>
+      </w:r>
+    </w:p>
+    <w:p>
+      <w:pPr>
+        <w:pStyle w:val="ListNumber"/>
       </w:pPr>
       <w:r>
         <w:rPr>
@@ -5990,7 +6073,189 @@
     </w:p>
     <w:p>
       <w:pPr>
-        <w:pStyle w:val="ListBullet"/>
+        <w:pStyle w:val="ListNumber"/>
+      </w:pPr>
+      <w:r>
+        <w:rPr>
+          <w:b/>
+        </w:rPr>
+        <w:t>Wang, Y.; Li, P.; Sun, M.; Liu, Y.</w:t>
+      </w:r>
+      <w:r>
+        <w:t xml:space="preserve"> Self-Knowledge Guided Retrieval Augmentation for Large Language Models (SKR). In *Findings of EMNLP 2023*. arXiv:2310.05002.</w:t>
+      </w:r>
+    </w:p>
+    <w:p>
+      <w:pPr>
+        <w:pStyle w:val="ListNumber"/>
+      </w:pPr>
+      <w:r>
+        <w:rPr>
+          <w:b/>
+        </w:rPr>
+        <w:t>Jeong, S.; Baek, J.; Cho, S.; Hwang, S. J.; Park, J. C.</w:t>
+      </w:r>
+      <w:r>
+        <w:t xml:space="preserve"> Adaptive-RAG: Learning to Adapt Retrieval-Augmented Large Language Models through Question Complexity. In *NAACL 2024*, pp. 7036–7056. arXiv:2403.14403.</w:t>
+      </w:r>
+    </w:p>
+    <w:p>
+      <w:pPr>
+        <w:pStyle w:val="ListNumber"/>
+      </w:pPr>
+      <w:r>
+        <w:rPr>
+          <w:b/>
+        </w:rPr>
+        <w:t>Press, O.; Zhang, M.; Min, S.; Schmidt, L.; Smith, N. A.; Lewis, M.</w:t>
+      </w:r>
+      <w:r>
+        <w:t xml:space="preserve"> Measuring and Narrowing the Compositionality Gap in Language Models (Self-Ask). In *Findings of EMNLP 2023*. arXiv:2210.03350.</w:t>
+      </w:r>
+    </w:p>
+    <w:p>
+      <w:pPr>
+        <w:pStyle w:val="ListNumber"/>
+      </w:pPr>
+      <w:r>
+        <w:rPr>
+          <w:b/>
+        </w:rPr>
+        <w:t>Trivedi, H.; Balasubramanian, N.; Khot, T.; Sabharwal, A.</w:t>
+      </w:r>
+      <w:r>
+        <w:t xml:space="preserve"> Interleaving Retrieval with Chain-of-Thought Reasoning for Knowledge-Intensive Multi-Step Questions (IRCoT). In *ACL 2023*. arXiv:2212.10509.</w:t>
+      </w:r>
+    </w:p>
+    <w:p>
+      <w:pPr>
+        <w:pStyle w:val="ListNumber"/>
+      </w:pPr>
+      <w:r>
+        <w:rPr>
+          <w:b/>
+        </w:rPr>
+        <w:t>Yan, S.-Q.; Gu, J.-C.; Zhu, Y.; Ling, Z.-H.</w:t>
+      </w:r>
+      <w:r>
+        <w:t xml:space="preserve"> Corrective Retrieval Augmented Generation (CRAG). arXiv:2401.15884, 2024.</w:t>
+      </w:r>
+    </w:p>
+    <w:p>
+      <w:pPr>
+        <w:pStyle w:val="ListNumber"/>
+      </w:pPr>
+      <w:r>
+        <w:rPr>
+          <w:b/>
+        </w:rPr>
+        <w:t>Wu, M.; Yang, H.; Ben-Porat, O.; Ziser, Y.</w:t>
+      </w:r>
+      <w:r>
+        <w:t xml:space="preserve"> When Knowledge Is Not Free: Cost-Aware Evidence Selection in Retrieval-Augmented Generation. arXiv:2606.02245, 2026.</w:t>
+      </w:r>
+    </w:p>
+    <w:p>
+      <w:pPr>
+        <w:pStyle w:val="ListNumber"/>
+      </w:pPr>
+      <w:r>
+        <w:rPr>
+          <w:b/>
+        </w:rPr>
+        <w:t>Jiang, H.; Wu, Q.; Lin, C.-Y.; Yang, Y.; Qiu, L.</w:t>
+      </w:r>
+      <w:r>
+        <w:t xml:space="preserve"> LLMLingua: Compressing Prompts for Accelerated Inference of Large Language Models. In *EMNLP 2023*. arXiv:2310.05736.</w:t>
+      </w:r>
+    </w:p>
+    <w:p>
+      <w:pPr>
+        <w:pStyle w:val="ListNumber"/>
+      </w:pPr>
+      <w:r>
+        <w:rPr>
+          <w:b/>
+        </w:rPr>
+        <w:t>Jiang, H.; Wu, Q.; Luo, X.; Li, D.; Lin, C.-Y.; Yang, Y.; Qiu, L.</w:t>
+      </w:r>
+      <w:r>
+        <w:t xml:space="preserve"> LongLLMLingua: Accelerating and Enhancing LLMs in Long Context Scenarios via Prompt Compression. In *ACL 2024*. arXiv:2310.06839.</w:t>
+      </w:r>
+    </w:p>
+    <w:p>
+      <w:pPr>
+        <w:pStyle w:val="ListNumber"/>
+      </w:pPr>
+      <w:r>
+        <w:rPr>
+          <w:b/>
+        </w:rPr>
+        <w:t>Xu, F.; Shi, W.; Choi, E.</w:t>
+      </w:r>
+      <w:r>
+        <w:t xml:space="preserve"> RECOMP: Improving Retrieval-Augmented LMs with Compression and Selective Augmentation. In *ICLR 2024*. arXiv:2310.04408.</w:t>
+      </w:r>
+    </w:p>
+    <w:p>
+      <w:pPr>
+        <w:pStyle w:val="ListNumber"/>
+      </w:pPr>
+      <w:r>
+        <w:rPr>
+          <w:b/>
+        </w:rPr>
+        <w:t>Nogueira, R.; Jiang, Z.; Pradeep, R.; Lin, J.</w:t>
+      </w:r>
+      <w:r>
+        <w:t xml:space="preserve"> Document Ranking with a Pretrained Sequence-to-Sequence Model. In *Findings of EMNLP 2020*. arXiv:2003.06713.</w:t>
+      </w:r>
+    </w:p>
+    <w:p>
+      <w:pPr>
+        <w:pStyle w:val="ListNumber"/>
+      </w:pPr>
+      <w:r>
+        <w:rPr>
+          <w:b/>
+        </w:rPr>
+        <w:t>Sun, W.; Yan, L.; Ma, X.; Wang, S.; Ren, P.; Chen, Z.; Yin, D.; Ren, Z.</w:t>
+      </w:r>
+      <w:r>
+        <w:t xml:space="preserve"> Is ChatGPT Good at Search? Investigating Large Language Models as Re-Ranking Agents (RankGPT). In *EMNLP 2023*. arXiv:2304.09542.</w:t>
+      </w:r>
+    </w:p>
+    <w:p>
+      <w:pPr>
+        <w:pStyle w:val="ListNumber"/>
+      </w:pPr>
+      <w:r>
+        <w:rPr>
+          <w:b/>
+        </w:rPr>
+        <w:t>Gao, L.; Ma, X.; Lin, J.; Callan, J.</w:t>
+      </w:r>
+      <w:r>
+        <w:t xml:space="preserve"> Precise Zero-Shot Dense Retrieval without Relevance Labels (HyDE). In *ACL 2023*. arXiv:2212.10496.</w:t>
+      </w:r>
+    </w:p>
+    <w:p>
+      <w:pPr>
+        <w:pStyle w:val="ListNumber"/>
+      </w:pPr>
+      <w:r>
+        <w:rPr>
+          <w:b/>
+        </w:rPr>
+        <w:t>Ma, X.; Gong, Y.; He, P.; Zhao, H.; Duan, N.</w:t>
+      </w:r>
+      <w:r>
+        <w:t xml:space="preserve"> Query Rewriting for Retrieval-Augmented Large Language Models. In *EMNLP 2023*. arXiv:2305.14283.</w:t>
+      </w:r>
+    </w:p>
+    <w:p>
+      <w:pPr>
+        <w:pStyle w:val="ListNumber"/>
       </w:pPr>
       <w:r>
         <w:rPr>
@@ -6004,7 +6269,81 @@
     </w:p>
     <w:p>
       <w:pPr>
-        <w:pStyle w:val="ListBullet"/>
+        <w:pStyle w:val="ListNumber"/>
+      </w:pPr>
+      <w:r>
+        <w:rPr>
+          <w:b/>
+        </w:rPr>
+        <w:t>Lin, H.; Bilmes, J.</w:t>
+      </w:r>
+      <w:r>
+        <w:t xml:space="preserve"> A Class of Submodular Functions for Document Summarization. In *ACL-HLT 2011*, pp. 510–520.</w:t>
+      </w:r>
+    </w:p>
+    <w:p>
+      <w:pPr>
+        <w:pStyle w:val="ListNumber"/>
+      </w:pPr>
+      <w:r>
+        <w:rPr>
+          <w:b/>
+        </w:rPr>
+        <w:t>Nemhauser, G. L.; Wolsey, L. A.; Fisher, M. L.</w:t>
+      </w:r>
+      <w:r>
+        <w:t xml:space="preserve"> An Analysis of Approximations for Maximizing Submodular Set Functions—I. *Mathematical Programming* </w:t>
+      </w:r>
+      <w:r>
+        <w:rPr>
+          <w:b/>
+        </w:rPr>
+        <w:t>1978</w:t>
+      </w:r>
+      <w:r>
+        <w:t>, 14(1), 265–294.</w:t>
+      </w:r>
+    </w:p>
+    <w:p>
+      <w:pPr>
+        <w:pStyle w:val="ListNumber"/>
+      </w:pPr>
+      <w:r>
+        <w:rPr>
+          <w:b/>
+        </w:rPr>
+        <w:t>Khuller, S.; Moss, A.; Naor, J.</w:t>
+      </w:r>
+      <w:r>
+        <w:t xml:space="preserve"> The Budgeted Maximum Coverage Problem. *Information Processing Letters* </w:t>
+      </w:r>
+      <w:r>
+        <w:rPr>
+          <w:b/>
+        </w:rPr>
+        <w:t>1999</w:t>
+      </w:r>
+      <w:r>
+        <w:t>, 70(1), 39–45.</w:t>
+      </w:r>
+    </w:p>
+    <w:p>
+      <w:pPr>
+        <w:pStyle w:val="ListNumber"/>
+      </w:pPr>
+      <w:r>
+        <w:rPr>
+          <w:b/>
+        </w:rPr>
+        <w:t>Wald, A.</w:t>
+      </w:r>
+      <w:r>
+        <w:t xml:space="preserve"> *Sequential Analysis*; Wiley: New York, 1947.</w:t>
+      </w:r>
+    </w:p>
+    <w:p>
+      <w:pPr>
+        <w:pStyle w:val="ListNumber"/>
       </w:pPr>
       <w:r>
         <w:rPr>
@@ -6014,350 +6353,6 @@
       </w:r>
       <w:r>
         <w:t xml:space="preserve"> FrugalGPT: How to Use Large Language Models While Reducing Cost and Improving Performance. arXiv:2305.05176, 2023.</w:t>
-      </w:r>
-    </w:p>
-    <w:p>
-      <w:pPr>
-        <w:pStyle w:val="ListBullet"/>
-      </w:pPr>
-      <w:r>
-        <w:rPr>
-          <w:b/>
-        </w:rPr>
-        <w:t>Gao, L.; Ma, X.; Lin, J.; Callan, J.</w:t>
-      </w:r>
-      <w:r>
-        <w:t xml:space="preserve"> Precise Zero-Shot Dense Retrieval without Relevance Labels (HyDE). In *ACL 2023*. arXiv:2212.10496.</w:t>
-      </w:r>
-    </w:p>
-    <w:p>
-      <w:pPr>
-        <w:pStyle w:val="ListBullet"/>
-      </w:pPr>
-      <w:r>
-        <w:rPr>
-          <w:b/>
-        </w:rPr>
-        <w:t>Jeong, S.; Baek, J.; Cho, S.; Hwang, S. J.; Park, J. C.</w:t>
-      </w:r>
-      <w:r>
-        <w:t xml:space="preserve"> Adaptive-RAG: Learning to Adapt Retrieval-Augmented Large Language Models through Question Complexity. In *NAACL 2024*, pp. 7036–7056. arXiv:2403.14403.</w:t>
-      </w:r>
-    </w:p>
-    <w:p>
-      <w:pPr>
-        <w:pStyle w:val="ListBullet"/>
-      </w:pPr>
-      <w:r>
-        <w:rPr>
-          <w:b/>
-        </w:rPr>
-        <w:t>Jiang, H.; Wu, Q.; Lin, C.-Y.; Yang, Y.; Qiu, L.</w:t>
-      </w:r>
-      <w:r>
-        <w:t xml:space="preserve"> LLMLingua: Compressing Prompts for Accelerated Inference of Large Language Models. In *EMNLP 2023*. arXiv:2310.05736.</w:t>
-      </w:r>
-    </w:p>
-    <w:p>
-      <w:pPr>
-        <w:pStyle w:val="ListBullet"/>
-      </w:pPr>
-      <w:r>
-        <w:rPr>
-          <w:b/>
-        </w:rPr>
-        <w:t>Jiang, H.; Wu, Q.; Luo, X.; Li, D.; Lin, C.-Y.; Yang, Y.; Qiu, L.</w:t>
-      </w:r>
-      <w:r>
-        <w:t xml:space="preserve"> LongLLMLingua: Accelerating and Enhancing LLMs in Long Context Scenarios via Prompt Compression. In *ACL 2024*. arXiv:2310.06839.</w:t>
-      </w:r>
-    </w:p>
-    <w:p>
-      <w:pPr>
-        <w:pStyle w:val="ListBullet"/>
-      </w:pPr>
-      <w:r>
-        <w:rPr>
-          <w:b/>
-        </w:rPr>
-        <w:t>Jiang, Z.; Xu, F. F.; Gao, L.; Sun, Z.; Liu, Q.; Dwivedi-Yu, J.; Yang, Y.; Callan, J.; Neubig, G.</w:t>
-      </w:r>
-      <w:r>
-        <w:t xml:space="preserve"> Active Retrieval Augmented Generation (FLARE). In *EMNLP 2023*. arXiv:2305.06983.</w:t>
-      </w:r>
-    </w:p>
-    <w:p>
-      <w:pPr>
-        <w:pStyle w:val="ListBullet"/>
-      </w:pPr>
-      <w:r>
-        <w:rPr>
-          <w:b/>
-        </w:rPr>
-        <w:t>Karpukhin, V.; Oğuz, B.; Min, S.; Lewis, P.; Wu, L.; Edunov, S.; Chen, D.; Yih, W.-t.</w:t>
-      </w:r>
-      <w:r>
-        <w:t xml:space="preserve"> Dense Passage Retrieval for Open-Domain Question Answering. In *EMNLP 2020*. arXiv:2004.04906.</w:t>
-      </w:r>
-    </w:p>
-    <w:p>
-      <w:pPr>
-        <w:pStyle w:val="ListBullet"/>
-      </w:pPr>
-      <w:r>
-        <w:rPr>
-          <w:b/>
-        </w:rPr>
-        <w:t>Khuller, S.; Moss, A.; Naor, J.</w:t>
-      </w:r>
-      <w:r>
-        <w:t xml:space="preserve"> The Budgeted Maximum Coverage Problem. *Information Processing Letters* </w:t>
-      </w:r>
-      <w:r>
-        <w:rPr>
-          <w:b/>
-        </w:rPr>
-        <w:t>1999</w:t>
-      </w:r>
-      <w:r>
-        <w:t>, 70(1), 39–45.</w:t>
-      </w:r>
-    </w:p>
-    <w:p>
-      <w:pPr>
-        <w:pStyle w:val="ListBullet"/>
-      </w:pPr>
-      <w:r>
-        <w:rPr>
-          <w:b/>
-        </w:rPr>
-        <w:t>Lewis, P.; Perez, E.; Piktus, A.; Petroni, F.; Karpukhin, V.; Goyal, N.; Küttler, H.; Lewis, M.; Yih, W.-t.; Rocktäschel, T.; Riedel, S.; Kiela, D.</w:t>
-      </w:r>
-      <w:r>
-        <w:t xml:space="preserve"> Retrieval-Augmented Generation for Knowledge-Intensive NLP Tasks. In *NeurIPS 2020*. arXiv:2005.11401.</w:t>
-      </w:r>
-    </w:p>
-    <w:p>
-      <w:pPr>
-        <w:pStyle w:val="ListBullet"/>
-      </w:pPr>
-      <w:r>
-        <w:rPr>
-          <w:b/>
-        </w:rPr>
-        <w:t>Lin, H.; Bilmes, J.</w:t>
-      </w:r>
-      <w:r>
-        <w:t xml:space="preserve"> A Class of Submodular Functions for Document Summarization. In *ACL-HLT 2011*, pp. 510–520.</w:t>
-      </w:r>
-    </w:p>
-    <w:p>
-      <w:pPr>
-        <w:pStyle w:val="ListBullet"/>
-      </w:pPr>
-      <w:r>
-        <w:rPr>
-          <w:b/>
-        </w:rPr>
-        <w:t>Liu, N. F.; Lin, K.; Hewitt, J.; Paranjape, A.; Bevilacqua, M.; Petroni, F.; Liang, P.</w:t>
-      </w:r>
-      <w:r>
-        <w:t xml:space="preserve"> Lost in the Middle: How Language Models Use Long Contexts. *TACL* </w:t>
-      </w:r>
-      <w:r>
-        <w:rPr>
-          <w:b/>
-        </w:rPr>
-        <w:t>2024</w:t>
-      </w:r>
-      <w:r>
-        <w:t>, 12, 157–173. arXiv:2307.03172.</w:t>
-      </w:r>
-    </w:p>
-    <w:p>
-      <w:pPr>
-        <w:pStyle w:val="ListBullet"/>
-      </w:pPr>
-      <w:r>
-        <w:rPr>
-          <w:b/>
-        </w:rPr>
-        <w:t>Ma, X.; Gong, Y.; He, P.; Zhao, H.; Duan, N.</w:t>
-      </w:r>
-      <w:r>
-        <w:t xml:space="preserve"> Query Rewriting for Retrieval-Augmented Large Language Models. In *EMNLP 2023*. arXiv:2305.14283.</w:t>
-      </w:r>
-    </w:p>
-    <w:p>
-      <w:pPr>
-        <w:pStyle w:val="ListBullet"/>
-      </w:pPr>
-      <w:r>
-        <w:rPr>
-          <w:b/>
-        </w:rPr>
-        <w:t>Nemhauser, G. L.; Wolsey, L. A.; Fisher, M. L.</w:t>
-      </w:r>
-      <w:r>
-        <w:t xml:space="preserve"> An Analysis of Approximations for Maximizing Submodular Set Functions—I. *Mathematical Programming* </w:t>
-      </w:r>
-      <w:r>
-        <w:rPr>
-          <w:b/>
-        </w:rPr>
-        <w:t>1978</w:t>
-      </w:r>
-      <w:r>
-        <w:t>, 14(1), 265–294.</w:t>
-      </w:r>
-    </w:p>
-    <w:p>
-      <w:pPr>
-        <w:pStyle w:val="ListBullet"/>
-      </w:pPr>
-      <w:r>
-        <w:rPr>
-          <w:b/>
-        </w:rPr>
-        <w:t>Nogueira, R.; Jiang, Z.; Pradeep, R.; Lin, J.</w:t>
-      </w:r>
-      <w:r>
-        <w:t xml:space="preserve"> Document Ranking with a Pretrained Sequence-to-Sequence Model. In *Findings of EMNLP 2020*. arXiv:2003.06713.</w:t>
-      </w:r>
-    </w:p>
-    <w:p>
-      <w:pPr>
-        <w:pStyle w:val="ListBullet"/>
-      </w:pPr>
-      <w:r>
-        <w:rPr>
-          <w:b/>
-        </w:rPr>
-        <w:t>Press, O.; Zhang, M.; Min, S.; Schmidt, L.; Smith, N. A.; Lewis, M.</w:t>
-      </w:r>
-      <w:r>
-        <w:t xml:space="preserve"> Measuring and Narrowing the Compositionality Gap in Language Models (Self-Ask). In *Findings of EMNLP 2023*. arXiv:2210.03350.</w:t>
-      </w:r>
-    </w:p>
-    <w:p>
-      <w:pPr>
-        <w:pStyle w:val="ListBullet"/>
-      </w:pPr>
-      <w:r>
-        <w:rPr>
-          <w:b/>
-        </w:rPr>
-        <w:t>Robertson, S.; Zaragoza, H.</w:t>
-      </w:r>
-      <w:r>
-        <w:t xml:space="preserve"> The Probabilistic Relevance Framework: BM25 and Beyond. *Foundations and Trends in Information Retrieval* </w:t>
-      </w:r>
-      <w:r>
-        <w:rPr>
-          <w:b/>
-        </w:rPr>
-        <w:t>2009</w:t>
-      </w:r>
-      <w:r>
-        <w:t>, 3(4), 333–389.</w:t>
-      </w:r>
-    </w:p>
-    <w:p>
-      <w:pPr>
-        <w:pStyle w:val="ListBullet"/>
-      </w:pPr>
-      <w:r>
-        <w:rPr>
-          <w:b/>
-        </w:rPr>
-        <w:t>Sun, W.; Yan, L.; Ma, X.; Wang, S.; Ren, P.; Chen, Z.; Yin, D.; Ren, Z.</w:t>
-      </w:r>
-      <w:r>
-        <w:t xml:space="preserve"> Is ChatGPT Good at Search? Investigating Large Language Models as Re-Ranking Agents (RankGPT). In *EMNLP 2023*. arXiv:2304.09542.</w:t>
-      </w:r>
-    </w:p>
-    <w:p>
-      <w:pPr>
-        <w:pStyle w:val="ListBullet"/>
-      </w:pPr>
-      <w:r>
-        <w:rPr>
-          <w:b/>
-        </w:rPr>
-        <w:t>Trivedi, H.; Balasubramanian, N.; Khot, T.; Sabharwal, A.</w:t>
-      </w:r>
-      <w:r>
-        <w:t xml:space="preserve"> Interleaving Retrieval with Chain-of-Thought Reasoning for Knowledge-Intensive Multi-Step Questions (IRCoT). In *ACL 2023*. arXiv:2212.10509.</w:t>
-      </w:r>
-    </w:p>
-    <w:p>
-      <w:pPr>
-        <w:pStyle w:val="ListBullet"/>
-      </w:pPr>
-      <w:r>
-        <w:rPr>
-          <w:b/>
-        </w:rPr>
-        <w:t>Wald, A.</w:t>
-      </w:r>
-      <w:r>
-        <w:t xml:space="preserve"> *Sequential Analysis*; Wiley: New York, 1947.</w:t>
-      </w:r>
-    </w:p>
-    <w:p>
-      <w:pPr>
-        <w:pStyle w:val="ListBullet"/>
-      </w:pPr>
-      <w:r>
-        <w:rPr>
-          <w:b/>
-        </w:rPr>
-        <w:t>Wang, Y.; Li, P.; Sun, M.; Liu, Y.</w:t>
-      </w:r>
-      <w:r>
-        <w:t xml:space="preserve"> Self-Knowledge Guided Retrieval Augmentation for Large Language Models (SKR). In *Findings of EMNLP 2023*. arXiv:2310.05002.</w:t>
-      </w:r>
-    </w:p>
-    <w:p>
-      <w:pPr>
-        <w:pStyle w:val="ListBullet"/>
-      </w:pPr>
-      <w:r>
-        <w:rPr>
-          <w:b/>
-        </w:rPr>
-        <w:t>Wu, M.; Yang, H.; Ben-Porat, O.; Ziser, Y.</w:t>
-      </w:r>
-      <w:r>
-        <w:t xml:space="preserve"> When Knowledge Is Not Free: Cost-Aware Evidence Selection in Retrieval-Augmented Generation. arXiv:2606.02245, 2026.</w:t>
-      </w:r>
-    </w:p>
-    <w:p>
-      <w:pPr>
-        <w:pStyle w:val="ListBullet"/>
-      </w:pPr>
-      <w:r>
-        <w:rPr>
-          <w:b/>
-        </w:rPr>
-        <w:t>Xu, F.; Shi, W.; Choi, E.</w:t>
-      </w:r>
-      <w:r>
-        <w:t xml:space="preserve"> RECOMP: Improving Retrieval-Augmented LMs with Compression and Selective Augmentation. In *ICLR 2024*. arXiv:2310.04408.</w:t>
-      </w:r>
-    </w:p>
-    <w:p>
-      <w:pPr>
-        <w:pStyle w:val="ListBullet"/>
-      </w:pPr>
-      <w:r>
-        <w:rPr>
-          <w:b/>
-        </w:rPr>
-        <w:t>Yan, S.-Q.; Gu, J.-C.; Zhu, Y.; Ling, Z.-H.</w:t>
-      </w:r>
-      <w:r>
-        <w:t xml:space="preserve"> Corrective Retrieval Augmented Generation (CRAG). arXiv:2401.15884, 2024.</w:t>
       </w:r>
     </w:p>
     <w:p>

</xml_diff>

<commit_message>
fix(paper): 补回英文稿缺失的 6.10/6.11 与图 4
- 之前插入脚本锚点未匹配但未报错，导致英文稿静默缺两节
- 现按真实锚点插回，英文 9 表 4 图、中文 9 表 4 图
- 图 4：A 四检索器预算-召回曲线 + 目标线；B 达标率-安全边际
- 修正绘图边距与标签重叠
</commit_message>
<xml_diff>
--- a/docs/paper-en.docx
+++ b/docs/paper-en.docx
@@ -4920,6 +4920,1296 @@
       </w:r>
       <w:r>
         <w:t xml:space="preserve"> The high recall observed on the synthetic corpus is a controlled-setting result and is not claimed to generalize.</w:t>
+      </w:r>
+    </w:p>
+    <w:p>
+      <w:pPr>
+        <w:pStyle w:val="Heading2"/>
+      </w:pPr>
+      <w:r>
+        <w:t>6.10 From a Budget to a Quality Target</w:t>
+      </w:r>
+    </w:p>
+    <w:p>
+      <w:r>
+        <w:t>Users do not ask for "300 tokens"; they ask for "90% recall". Turning the second into the first is a calibration problem that the budget framing makes explicit, and it can be solved with a handful of labelled questions.</w:t>
+      </w:r>
+    </w:p>
+    <w:p>
+      <w:r>
+        <w:rPr>
+          <w:b/>
+        </w:rPr>
+        <w:t>Protocol.</w:t>
+      </w:r>
+      <w:r>
+        <w:t xml:space="preserve"> Sample N labelled questions (N = 20), record for each the smallest budget at which the answer span enters the context, fit a saturating curve recall(B) = R_inf(1 - exp(-B/s)), and invert it for the budget that reaches a target T plus a safety margin delta. A closed-loop step re-checks the prediction on the fitting sample and multiplies the budget by 1.6 (up to three rounds) when the estimate falls short; if T exceeds the retriever's achievable ceiling, the protocol reports the target as unreachable instead of promising it. Thirty random splits separate fitting from evaluation.</w:t>
+      </w:r>
+    </w:p>
+    <w:tbl>
+      <w:tblPr>
+        <w:tblStyle w:val="TableGrid"/>
+        <w:tblW w:type="auto" w:w="0"/>
+        <w:tblLook w:firstColumn="1" w:firstRow="1" w:lastColumn="0" w:lastRow="0" w:noHBand="0" w:noVBand="1" w:val="04A0"/>
+      </w:tblPr>
+      <w:tblGrid>
+        <w:gridCol w:w="1234"/>
+        <w:gridCol w:w="1234"/>
+        <w:gridCol w:w="1234"/>
+        <w:gridCol w:w="1234"/>
+        <w:gridCol w:w="1234"/>
+        <w:gridCol w:w="1234"/>
+        <w:gridCol w:w="1234"/>
+      </w:tblGrid>
+      <w:tr>
+        <w:tc>
+          <w:tcPr>
+            <w:tcW w:type="dxa" w:w="1234"/>
+          </w:tcPr>
+          <w:p>
+            <w:r>
+              <w:rPr>
+                <w:b/>
+                <w:sz w:val="18"/>
+              </w:rPr>
+            </w:r>
+            <w:r>
+              <w:rPr>
+                <w:b/>
+                <w:sz w:val="18"/>
+              </w:rPr>
+              <w:t>Retriever</w:t>
+            </w:r>
+          </w:p>
+        </w:tc>
+        <w:tc>
+          <w:tcPr>
+            <w:tcW w:type="dxa" w:w="1234"/>
+          </w:tcPr>
+          <w:p>
+            <w:r>
+              <w:rPr>
+                <w:b/>
+                <w:sz w:val="18"/>
+              </w:rPr>
+            </w:r>
+            <w:r>
+              <w:rPr>
+                <w:b/>
+                <w:sz w:val="18"/>
+              </w:rPr>
+              <w:t>Target</w:t>
+            </w:r>
+          </w:p>
+        </w:tc>
+        <w:tc>
+          <w:tcPr>
+            <w:tcW w:type="dxa" w:w="1234"/>
+          </w:tcPr>
+          <w:p>
+            <w:r>
+              <w:rPr>
+                <w:b/>
+                <w:sz w:val="18"/>
+              </w:rPr>
+            </w:r>
+            <w:r>
+              <w:rPr>
+                <w:b/>
+                <w:sz w:val="18"/>
+              </w:rPr>
+              <w:t>Delta</w:t>
+            </w:r>
+          </w:p>
+        </w:tc>
+        <w:tc>
+          <w:tcPr>
+            <w:tcW w:type="dxa" w:w="1234"/>
+          </w:tcPr>
+          <w:p>
+            <w:r>
+              <w:rPr>
+                <w:b/>
+                <w:sz w:val="18"/>
+              </w:rPr>
+            </w:r>
+            <w:r>
+              <w:rPr>
+                <w:b/>
+                <w:sz w:val="18"/>
+              </w:rPr>
+              <w:t>Predicted budget</w:t>
+            </w:r>
+          </w:p>
+        </w:tc>
+        <w:tc>
+          <w:tcPr>
+            <w:tcW w:type="dxa" w:w="1234"/>
+          </w:tcPr>
+          <w:p>
+            <w:r>
+              <w:rPr>
+                <w:b/>
+                <w:sz w:val="18"/>
+              </w:rPr>
+            </w:r>
+            <w:r>
+              <w:rPr>
+                <w:b/>
+                <w:sz w:val="18"/>
+              </w:rPr>
+              <w:t>Actual recall</w:t>
+            </w:r>
+          </w:p>
+        </w:tc>
+        <w:tc>
+          <w:tcPr>
+            <w:tcW w:type="dxa" w:w="1234"/>
+          </w:tcPr>
+          <w:p>
+            <w:r>
+              <w:rPr>
+                <w:b/>
+                <w:sz w:val="18"/>
+              </w:rPr>
+            </w:r>
+            <w:r>
+              <w:rPr>
+                <w:b/>
+                <w:sz w:val="18"/>
+              </w:rPr>
+              <w:t>Reach rate</w:t>
+            </w:r>
+          </w:p>
+        </w:tc>
+        <w:tc>
+          <w:tcPr>
+            <w:tcW w:type="dxa" w:w="1234"/>
+          </w:tcPr>
+          <w:p>
+            <w:r>
+              <w:rPr>
+                <w:b/>
+                <w:sz w:val="18"/>
+              </w:rPr>
+            </w:r>
+            <w:r>
+              <w:rPr>
+                <w:b/>
+                <w:sz w:val="18"/>
+              </w:rPr>
+              <w:t>Oracle budget</w:t>
+            </w:r>
+          </w:p>
+        </w:tc>
+      </w:tr>
+      <w:tr>
+        <w:tc>
+          <w:tcPr>
+            <w:tcW w:type="dxa" w:w="1234"/>
+          </w:tcPr>
+          <w:p>
+            <w:r>
+              <w:rPr>
+                <w:sz w:val="18"/>
+              </w:rPr>
+            </w:r>
+            <w:r>
+              <w:rPr>
+                <w:sz w:val="18"/>
+              </w:rPr>
+              <w:t>Hybrid (bge-m3)</w:t>
+            </w:r>
+          </w:p>
+        </w:tc>
+        <w:tc>
+          <w:tcPr>
+            <w:tcW w:type="dxa" w:w="1234"/>
+          </w:tcPr>
+          <w:p>
+            <w:r>
+              <w:rPr>
+                <w:sz w:val="18"/>
+              </w:rPr>
+            </w:r>
+            <w:r>
+              <w:rPr>
+                <w:sz w:val="18"/>
+              </w:rPr>
+              <w:t>0.80</w:t>
+            </w:r>
+          </w:p>
+        </w:tc>
+        <w:tc>
+          <w:tcPr>
+            <w:tcW w:type="dxa" w:w="1234"/>
+          </w:tcPr>
+          <w:p>
+            <w:r>
+              <w:rPr>
+                <w:sz w:val="18"/>
+              </w:rPr>
+            </w:r>
+            <w:r>
+              <w:rPr>
+                <w:sz w:val="18"/>
+              </w:rPr>
+              <w:t>0.05</w:t>
+            </w:r>
+          </w:p>
+        </w:tc>
+        <w:tc>
+          <w:tcPr>
+            <w:tcW w:type="dxa" w:w="1234"/>
+          </w:tcPr>
+          <w:p>
+            <w:r>
+              <w:rPr>
+                <w:sz w:val="18"/>
+              </w:rPr>
+            </w:r>
+            <w:r>
+              <w:rPr>
+                <w:sz w:val="18"/>
+              </w:rPr>
+              <w:t>139</w:t>
+            </w:r>
+          </w:p>
+        </w:tc>
+        <w:tc>
+          <w:tcPr>
+            <w:tcW w:type="dxa" w:w="1234"/>
+          </w:tcPr>
+          <w:p>
+            <w:r>
+              <w:rPr>
+                <w:sz w:val="18"/>
+              </w:rPr>
+            </w:r>
+            <w:r>
+              <w:rPr>
+                <w:sz w:val="18"/>
+              </w:rPr>
+              <w:t>0.864</w:t>
+            </w:r>
+          </w:p>
+        </w:tc>
+        <w:tc>
+          <w:tcPr>
+            <w:tcW w:type="dxa" w:w="1234"/>
+          </w:tcPr>
+          <w:p>
+            <w:r>
+              <w:rPr>
+                <w:sz w:val="18"/>
+              </w:rPr>
+            </w:r>
+            <w:r>
+              <w:rPr>
+                <w:sz w:val="18"/>
+              </w:rPr>
+              <w:t>0.93</w:t>
+            </w:r>
+          </w:p>
+        </w:tc>
+        <w:tc>
+          <w:tcPr>
+            <w:tcW w:type="dxa" w:w="1234"/>
+          </w:tcPr>
+          <w:p>
+            <w:r>
+              <w:rPr>
+                <w:sz w:val="18"/>
+              </w:rPr>
+            </w:r>
+            <w:r>
+              <w:rPr>
+                <w:sz w:val="18"/>
+              </w:rPr>
+              <w:t>120</w:t>
+            </w:r>
+          </w:p>
+        </w:tc>
+      </w:tr>
+      <w:tr>
+        <w:tc>
+          <w:tcPr>
+            <w:tcW w:type="dxa" w:w="1234"/>
+          </w:tcPr>
+          <w:p>
+            <w:r>
+              <w:rPr>
+                <w:sz w:val="18"/>
+              </w:rPr>
+            </w:r>
+            <w:r>
+              <w:rPr>
+                <w:sz w:val="18"/>
+              </w:rPr>
+              <w:t>Hybrid (bge-m3)</w:t>
+            </w:r>
+          </w:p>
+        </w:tc>
+        <w:tc>
+          <w:tcPr>
+            <w:tcW w:type="dxa" w:w="1234"/>
+          </w:tcPr>
+          <w:p>
+            <w:r>
+              <w:rPr>
+                <w:sz w:val="18"/>
+              </w:rPr>
+            </w:r>
+            <w:r>
+              <w:rPr>
+                <w:sz w:val="18"/>
+              </w:rPr>
+              <w:t>0.85</w:t>
+            </w:r>
+          </w:p>
+        </w:tc>
+        <w:tc>
+          <w:tcPr>
+            <w:tcW w:type="dxa" w:w="1234"/>
+          </w:tcPr>
+          <w:p>
+            <w:r>
+              <w:rPr>
+                <w:sz w:val="18"/>
+              </w:rPr>
+            </w:r>
+            <w:r>
+              <w:rPr>
+                <w:sz w:val="18"/>
+              </w:rPr>
+              <w:t>0.05</w:t>
+            </w:r>
+          </w:p>
+        </w:tc>
+        <w:tc>
+          <w:tcPr>
+            <w:tcW w:type="dxa" w:w="1234"/>
+          </w:tcPr>
+          <w:p>
+            <w:r>
+              <w:rPr>
+                <w:sz w:val="18"/>
+              </w:rPr>
+            </w:r>
+            <w:r>
+              <w:rPr>
+                <w:sz w:val="18"/>
+              </w:rPr>
+              <w:t>174</w:t>
+            </w:r>
+          </w:p>
+        </w:tc>
+        <w:tc>
+          <w:tcPr>
+            <w:tcW w:type="dxa" w:w="1234"/>
+          </w:tcPr>
+          <w:p>
+            <w:r>
+              <w:rPr>
+                <w:sz w:val="18"/>
+              </w:rPr>
+            </w:r>
+            <w:r>
+              <w:rPr>
+                <w:sz w:val="18"/>
+              </w:rPr>
+              <w:t>0.890</w:t>
+            </w:r>
+          </w:p>
+        </w:tc>
+        <w:tc>
+          <w:tcPr>
+            <w:tcW w:type="dxa" w:w="1234"/>
+          </w:tcPr>
+          <w:p>
+            <w:r>
+              <w:rPr>
+                <w:sz w:val="18"/>
+              </w:rPr>
+            </w:r>
+            <w:r>
+              <w:rPr>
+                <w:sz w:val="18"/>
+              </w:rPr>
+              <w:t>0.83</w:t>
+            </w:r>
+          </w:p>
+        </w:tc>
+        <w:tc>
+          <w:tcPr>
+            <w:tcW w:type="dxa" w:w="1234"/>
+          </w:tcPr>
+          <w:p>
+            <w:r>
+              <w:rPr>
+                <w:sz w:val="18"/>
+              </w:rPr>
+            </w:r>
+            <w:r>
+              <w:rPr>
+                <w:sz w:val="18"/>
+              </w:rPr>
+              <w:t>120</w:t>
+            </w:r>
+          </w:p>
+        </w:tc>
+      </w:tr>
+      <w:tr>
+        <w:tc>
+          <w:tcPr>
+            <w:tcW w:type="dxa" w:w="1234"/>
+          </w:tcPr>
+          <w:p>
+            <w:r>
+              <w:rPr>
+                <w:sz w:val="18"/>
+              </w:rPr>
+            </w:r>
+            <w:r>
+              <w:rPr>
+                <w:sz w:val="18"/>
+              </w:rPr>
+              <w:t>Hybrid (bge-m3)</w:t>
+            </w:r>
+          </w:p>
+        </w:tc>
+        <w:tc>
+          <w:tcPr>
+            <w:tcW w:type="dxa" w:w="1234"/>
+          </w:tcPr>
+          <w:p>
+            <w:r>
+              <w:rPr>
+                <w:sz w:val="18"/>
+              </w:rPr>
+            </w:r>
+            <w:r>
+              <w:rPr>
+                <w:sz w:val="18"/>
+              </w:rPr>
+              <w:t>0.90</w:t>
+            </w:r>
+          </w:p>
+        </w:tc>
+        <w:tc>
+          <w:tcPr>
+            <w:tcW w:type="dxa" w:w="1234"/>
+          </w:tcPr>
+          <w:p>
+            <w:r>
+              <w:rPr>
+                <w:sz w:val="18"/>
+              </w:rPr>
+            </w:r>
+            <w:r>
+              <w:rPr>
+                <w:sz w:val="18"/>
+              </w:rPr>
+              <w:t>0.05</w:t>
+            </w:r>
+          </w:p>
+        </w:tc>
+        <w:tc>
+          <w:tcPr>
+            <w:tcW w:type="dxa" w:w="1234"/>
+          </w:tcPr>
+          <w:p>
+            <w:r>
+              <w:rPr>
+                <w:sz w:val="18"/>
+              </w:rPr>
+            </w:r>
+            <w:r>
+              <w:rPr>
+                <w:sz w:val="18"/>
+              </w:rPr>
+              <w:t>194</w:t>
+            </w:r>
+          </w:p>
+        </w:tc>
+        <w:tc>
+          <w:tcPr>
+            <w:tcW w:type="dxa" w:w="1234"/>
+          </w:tcPr>
+          <w:p>
+            <w:r>
+              <w:rPr>
+                <w:sz w:val="18"/>
+              </w:rPr>
+            </w:r>
+            <w:r>
+              <w:rPr>
+                <w:sz w:val="18"/>
+              </w:rPr>
+              <w:t>0.907</w:t>
+            </w:r>
+          </w:p>
+        </w:tc>
+        <w:tc>
+          <w:tcPr>
+            <w:tcW w:type="dxa" w:w="1234"/>
+          </w:tcPr>
+          <w:p>
+            <w:r>
+              <w:rPr>
+                <w:sz w:val="18"/>
+              </w:rPr>
+            </w:r>
+            <w:r>
+              <w:rPr>
+                <w:sz w:val="18"/>
+              </w:rPr>
+              <w:t>0.76</w:t>
+            </w:r>
+          </w:p>
+        </w:tc>
+        <w:tc>
+          <w:tcPr>
+            <w:tcW w:type="dxa" w:w="1234"/>
+          </w:tcPr>
+          <w:p>
+            <w:r>
+              <w:rPr>
+                <w:sz w:val="18"/>
+              </w:rPr>
+            </w:r>
+            <w:r>
+              <w:rPr>
+                <w:sz w:val="18"/>
+              </w:rPr>
+              <w:t>180</w:t>
+            </w:r>
+          </w:p>
+        </w:tc>
+      </w:tr>
+      <w:tr>
+        <w:tc>
+          <w:tcPr>
+            <w:tcW w:type="dxa" w:w="1234"/>
+          </w:tcPr>
+          <w:p>
+            <w:r>
+              <w:rPr>
+                <w:sz w:val="18"/>
+              </w:rPr>
+            </w:r>
+            <w:r>
+              <w:rPr>
+                <w:sz w:val="18"/>
+              </w:rPr>
+              <w:t>Dense (bge-large-en)</w:t>
+            </w:r>
+          </w:p>
+        </w:tc>
+        <w:tc>
+          <w:tcPr>
+            <w:tcW w:type="dxa" w:w="1234"/>
+          </w:tcPr>
+          <w:p>
+            <w:r>
+              <w:rPr>
+                <w:sz w:val="18"/>
+              </w:rPr>
+            </w:r>
+            <w:r>
+              <w:rPr>
+                <w:sz w:val="18"/>
+              </w:rPr>
+              <w:t>0.80</w:t>
+            </w:r>
+          </w:p>
+        </w:tc>
+        <w:tc>
+          <w:tcPr>
+            <w:tcW w:type="dxa" w:w="1234"/>
+          </w:tcPr>
+          <w:p>
+            <w:r>
+              <w:rPr>
+                <w:sz w:val="18"/>
+              </w:rPr>
+            </w:r>
+            <w:r>
+              <w:rPr>
+                <w:sz w:val="18"/>
+              </w:rPr>
+              <w:t>0.10</w:t>
+            </w:r>
+          </w:p>
+        </w:tc>
+        <w:tc>
+          <w:tcPr>
+            <w:tcW w:type="dxa" w:w="1234"/>
+          </w:tcPr>
+          <w:p>
+            <w:r>
+              <w:rPr>
+                <w:sz w:val="18"/>
+              </w:rPr>
+            </w:r>
+            <w:r>
+              <w:rPr>
+                <w:sz w:val="18"/>
+              </w:rPr>
+              <w:t>189</w:t>
+            </w:r>
+          </w:p>
+        </w:tc>
+        <w:tc>
+          <w:tcPr>
+            <w:tcW w:type="dxa" w:w="1234"/>
+          </w:tcPr>
+          <w:p>
+            <w:r>
+              <w:rPr>
+                <w:sz w:val="18"/>
+              </w:rPr>
+            </w:r>
+            <w:r>
+              <w:rPr>
+                <w:sz w:val="18"/>
+              </w:rPr>
+              <w:t>0.842</w:t>
+            </w:r>
+          </w:p>
+        </w:tc>
+        <w:tc>
+          <w:tcPr>
+            <w:tcW w:type="dxa" w:w="1234"/>
+          </w:tcPr>
+          <w:p>
+            <w:r>
+              <w:rPr>
+                <w:sz w:val="18"/>
+              </w:rPr>
+            </w:r>
+            <w:r>
+              <w:rPr>
+                <w:sz w:val="18"/>
+              </w:rPr>
+              <w:t>0.86</w:t>
+            </w:r>
+          </w:p>
+        </w:tc>
+        <w:tc>
+          <w:tcPr>
+            <w:tcW w:type="dxa" w:w="1234"/>
+          </w:tcPr>
+          <w:p>
+            <w:r>
+              <w:rPr>
+                <w:sz w:val="18"/>
+              </w:rPr>
+            </w:r>
+            <w:r>
+              <w:rPr>
+                <w:sz w:val="18"/>
+              </w:rPr>
+              <w:t>180</w:t>
+            </w:r>
+          </w:p>
+        </w:tc>
+      </w:tr>
+      <w:tr>
+        <w:tc>
+          <w:tcPr>
+            <w:tcW w:type="dxa" w:w="1234"/>
+          </w:tcPr>
+          <w:p>
+            <w:r>
+              <w:rPr>
+                <w:sz w:val="18"/>
+              </w:rPr>
+            </w:r>
+            <w:r>
+              <w:rPr>
+                <w:sz w:val="18"/>
+              </w:rPr>
+              <w:t>Dense (bge-large-en)</w:t>
+            </w:r>
+          </w:p>
+        </w:tc>
+        <w:tc>
+          <w:tcPr>
+            <w:tcW w:type="dxa" w:w="1234"/>
+          </w:tcPr>
+          <w:p>
+            <w:r>
+              <w:rPr>
+                <w:sz w:val="18"/>
+              </w:rPr>
+            </w:r>
+            <w:r>
+              <w:rPr>
+                <w:sz w:val="18"/>
+              </w:rPr>
+              <w:t>0.85</w:t>
+            </w:r>
+          </w:p>
+        </w:tc>
+        <w:tc>
+          <w:tcPr>
+            <w:tcW w:type="dxa" w:w="1234"/>
+          </w:tcPr>
+          <w:p>
+            <w:r>
+              <w:rPr>
+                <w:sz w:val="18"/>
+              </w:rPr>
+            </w:r>
+            <w:r>
+              <w:rPr>
+                <w:sz w:val="18"/>
+              </w:rPr>
+              <w:t>0.10</w:t>
+            </w:r>
+          </w:p>
+        </w:tc>
+        <w:tc>
+          <w:tcPr>
+            <w:tcW w:type="dxa" w:w="1234"/>
+          </w:tcPr>
+          <w:p>
+            <w:r>
+              <w:rPr>
+                <w:sz w:val="18"/>
+              </w:rPr>
+            </w:r>
+            <w:r>
+              <w:rPr>
+                <w:sz w:val="18"/>
+              </w:rPr>
+              <w:t>218</w:t>
+            </w:r>
+          </w:p>
+        </w:tc>
+        <w:tc>
+          <w:tcPr>
+            <w:tcW w:type="dxa" w:w="1234"/>
+          </w:tcPr>
+          <w:p>
+            <w:r>
+              <w:rPr>
+                <w:sz w:val="18"/>
+              </w:rPr>
+            </w:r>
+            <w:r>
+              <w:rPr>
+                <w:sz w:val="18"/>
+              </w:rPr>
+              <w:t>0.856</w:t>
+            </w:r>
+          </w:p>
+        </w:tc>
+        <w:tc>
+          <w:tcPr>
+            <w:tcW w:type="dxa" w:w="1234"/>
+          </w:tcPr>
+          <w:p>
+            <w:r>
+              <w:rPr>
+                <w:sz w:val="18"/>
+              </w:rPr>
+            </w:r>
+            <w:r>
+              <w:rPr>
+                <w:sz w:val="18"/>
+              </w:rPr>
+              <w:t>0.33</w:t>
+            </w:r>
+          </w:p>
+        </w:tc>
+        <w:tc>
+          <w:tcPr>
+            <w:tcW w:type="dxa" w:w="1234"/>
+          </w:tcPr>
+          <w:p>
+            <w:r>
+              <w:rPr>
+                <w:sz w:val="18"/>
+              </w:rPr>
+            </w:r>
+            <w:r>
+              <w:rPr>
+                <w:sz w:val="18"/>
+              </w:rPr>
+              <w:t>250</w:t>
+            </w:r>
+          </w:p>
+        </w:tc>
+      </w:tr>
+      <w:tr>
+        <w:tc>
+          <w:tcPr>
+            <w:tcW w:type="dxa" w:w="1234"/>
+          </w:tcPr>
+          <w:p>
+            <w:r>
+              <w:rPr>
+                <w:sz w:val="18"/>
+              </w:rPr>
+            </w:r>
+            <w:r>
+              <w:rPr>
+                <w:sz w:val="18"/>
+              </w:rPr>
+              <w:t>Dense (bge-large-en)</w:t>
+            </w:r>
+          </w:p>
+        </w:tc>
+        <w:tc>
+          <w:tcPr>
+            <w:tcW w:type="dxa" w:w="1234"/>
+          </w:tcPr>
+          <w:p>
+            <w:r>
+              <w:rPr>
+                <w:sz w:val="18"/>
+              </w:rPr>
+            </w:r>
+            <w:r>
+              <w:rPr>
+                <w:sz w:val="18"/>
+              </w:rPr>
+              <w:t>0.90</w:t>
+            </w:r>
+          </w:p>
+        </w:tc>
+        <w:tc>
+          <w:tcPr>
+            <w:tcW w:type="dxa" w:w="1234"/>
+          </w:tcPr>
+          <w:p>
+            <w:r>
+              <w:rPr>
+                <w:sz w:val="18"/>
+              </w:rPr>
+            </w:r>
+            <w:r>
+              <w:rPr>
+                <w:sz w:val="18"/>
+              </w:rPr>
+              <w:t>0.10</w:t>
+            </w:r>
+          </w:p>
+        </w:tc>
+        <w:tc>
+          <w:tcPr>
+            <w:tcW w:type="dxa" w:w="1234"/>
+          </w:tcPr>
+          <w:p>
+            <w:r>
+              <w:rPr>
+                <w:sz w:val="18"/>
+              </w:rPr>
+            </w:r>
+            <w:r>
+              <w:rPr>
+                <w:sz w:val="18"/>
+              </w:rPr>
+              <w:t>502</w:t>
+            </w:r>
+          </w:p>
+        </w:tc>
+        <w:tc>
+          <w:tcPr>
+            <w:tcW w:type="dxa" w:w="1234"/>
+          </w:tcPr>
+          <w:p>
+            <w:r>
+              <w:rPr>
+                <w:sz w:val="18"/>
+              </w:rPr>
+            </w:r>
+            <w:r>
+              <w:rPr>
+                <w:sz w:val="18"/>
+              </w:rPr>
+              <w:t>0.925</w:t>
+            </w:r>
+          </w:p>
+        </w:tc>
+        <w:tc>
+          <w:tcPr>
+            <w:tcW w:type="dxa" w:w="1234"/>
+          </w:tcPr>
+          <w:p>
+            <w:r>
+              <w:rPr>
+                <w:sz w:val="18"/>
+              </w:rPr>
+            </w:r>
+            <w:r>
+              <w:rPr>
+                <w:sz w:val="18"/>
+              </w:rPr>
+              <w:t>0.94</w:t>
+            </w:r>
+          </w:p>
+        </w:tc>
+        <w:tc>
+          <w:tcPr>
+            <w:tcW w:type="dxa" w:w="1234"/>
+          </w:tcPr>
+          <w:p>
+            <w:r>
+              <w:rPr>
+                <w:sz w:val="18"/>
+              </w:rPr>
+            </w:r>
+            <w:r>
+              <w:rPr>
+                <w:sz w:val="18"/>
+              </w:rPr>
+              <w:t>500</w:t>
+            </w:r>
+          </w:p>
+        </w:tc>
+      </w:tr>
+      <w:tr>
+        <w:tc>
+          <w:tcPr>
+            <w:tcW w:type="dxa" w:w="1234"/>
+          </w:tcPr>
+          <w:p>
+            <w:r>
+              <w:rPr>
+                <w:sz w:val="18"/>
+              </w:rPr>
+            </w:r>
+            <w:r>
+              <w:rPr>
+                <w:sz w:val="18"/>
+              </w:rPr>
+              <w:t>BM25</w:t>
+            </w:r>
+          </w:p>
+        </w:tc>
+        <w:tc>
+          <w:tcPr>
+            <w:tcW w:type="dxa" w:w="1234"/>
+          </w:tcPr>
+          <w:p>
+            <w:r>
+              <w:rPr>
+                <w:sz w:val="18"/>
+              </w:rPr>
+            </w:r>
+            <w:r>
+              <w:rPr>
+                <w:sz w:val="18"/>
+              </w:rPr>
+              <w:t>0.80</w:t>
+            </w:r>
+          </w:p>
+        </w:tc>
+        <w:tc>
+          <w:tcPr>
+            <w:tcW w:type="dxa" w:w="1234"/>
+          </w:tcPr>
+          <w:p>
+            <w:r>
+              <w:rPr>
+                <w:sz w:val="18"/>
+              </w:rPr>
+            </w:r>
+            <w:r>
+              <w:rPr>
+                <w:sz w:val="18"/>
+              </w:rPr>
+              <w:t>0.05</w:t>
+            </w:r>
+          </w:p>
+        </w:tc>
+        <w:tc>
+          <w:tcPr>
+            <w:tcW w:type="dxa" w:w="1234"/>
+          </w:tcPr>
+          <w:p>
+            <w:r>
+              <w:rPr>
+                <w:sz w:val="18"/>
+              </w:rPr>
+            </w:r>
+            <w:r>
+              <w:rPr>
+                <w:sz w:val="18"/>
+              </w:rPr>
+              <w:t>215</w:t>
+            </w:r>
+          </w:p>
+        </w:tc>
+        <w:tc>
+          <w:tcPr>
+            <w:tcW w:type="dxa" w:w="1234"/>
+          </w:tcPr>
+          <w:p>
+            <w:r>
+              <w:rPr>
+                <w:sz w:val="18"/>
+              </w:rPr>
+            </w:r>
+            <w:r>
+              <w:rPr>
+                <w:sz w:val="18"/>
+              </w:rPr>
+              <w:t>0.777</w:t>
+            </w:r>
+          </w:p>
+        </w:tc>
+        <w:tc>
+          <w:tcPr>
+            <w:tcW w:type="dxa" w:w="1234"/>
+          </w:tcPr>
+          <w:p>
+            <w:r>
+              <w:rPr>
+                <w:sz w:val="18"/>
+              </w:rPr>
+            </w:r>
+            <w:r>
+              <w:rPr>
+                <w:sz w:val="18"/>
+              </w:rPr>
+              <w:t>0.42</w:t>
+            </w:r>
+          </w:p>
+        </w:tc>
+        <w:tc>
+          <w:tcPr>
+            <w:tcW w:type="dxa" w:w="1234"/>
+          </w:tcPr>
+          <w:p>
+            <w:r>
+              <w:rPr>
+                <w:sz w:val="18"/>
+              </w:rPr>
+            </w:r>
+            <w:r>
+              <w:rPr>
+                <w:sz w:val="18"/>
+              </w:rPr>
+              <w:t>350</w:t>
+            </w:r>
+          </w:p>
+        </w:tc>
+      </w:tr>
+      <w:tr>
+        <w:tc>
+          <w:tcPr>
+            <w:tcW w:type="dxa" w:w="1234"/>
+          </w:tcPr>
+          <w:p>
+            <w:r>
+              <w:rPr>
+                <w:sz w:val="18"/>
+              </w:rPr>
+            </w:r>
+            <w:r>
+              <w:rPr>
+                <w:sz w:val="18"/>
+              </w:rPr>
+              <w:t>BM25</w:t>
+            </w:r>
+          </w:p>
+        </w:tc>
+        <w:tc>
+          <w:tcPr>
+            <w:tcW w:type="dxa" w:w="1234"/>
+          </w:tcPr>
+          <w:p>
+            <w:r>
+              <w:rPr>
+                <w:sz w:val="18"/>
+              </w:rPr>
+            </w:r>
+            <w:r>
+              <w:rPr>
+                <w:sz w:val="18"/>
+              </w:rPr>
+              <w:t>0.90</w:t>
+            </w:r>
+          </w:p>
+        </w:tc>
+        <w:tc>
+          <w:tcPr>
+            <w:tcW w:type="dxa" w:w="1234"/>
+          </w:tcPr>
+          <w:p>
+            <w:r>
+              <w:rPr>
+                <w:sz w:val="18"/>
+              </w:rPr>
+            </w:r>
+            <w:r>
+              <w:rPr>
+                <w:sz w:val="18"/>
+              </w:rPr>
+              <w:t>0.05</w:t>
+            </w:r>
+          </w:p>
+        </w:tc>
+        <w:tc>
+          <w:tcPr>
+            <w:tcW w:type="dxa" w:w="1234"/>
+          </w:tcPr>
+          <w:p>
+            <w:r>
+              <w:rPr>
+                <w:sz w:val="18"/>
+              </w:rPr>
+            </w:r>
+            <w:r>
+              <w:rPr>
+                <w:sz w:val="18"/>
+              </w:rPr>
+              <w:t>285</w:t>
+            </w:r>
+          </w:p>
+        </w:tc>
+        <w:tc>
+          <w:tcPr>
+            <w:tcW w:type="dxa" w:w="1234"/>
+          </w:tcPr>
+          <w:p>
+            <w:r>
+              <w:rPr>
+                <w:sz w:val="18"/>
+              </w:rPr>
+            </w:r>
+            <w:r>
+              <w:rPr>
+                <w:sz w:val="18"/>
+              </w:rPr>
+              <w:t>0.794</w:t>
+            </w:r>
+          </w:p>
+        </w:tc>
+        <w:tc>
+          <w:tcPr>
+            <w:tcW w:type="dxa" w:w="1234"/>
+          </w:tcPr>
+          <w:p>
+            <w:r>
+              <w:rPr>
+                <w:sz w:val="18"/>
+              </w:rPr>
+            </w:r>
+            <w:r>
+              <w:rPr>
+                <w:sz w:val="18"/>
+              </w:rPr>
+              <w:t>0.00</w:t>
+            </w:r>
+          </w:p>
+        </w:tc>
+        <w:tc>
+          <w:tcPr>
+            <w:tcW w:type="dxa" w:w="1234"/>
+          </w:tcPr>
+          <w:p>
+            <w:r>
+              <w:rPr>
+                <w:sz w:val="18"/>
+              </w:rPr>
+            </w:r>
+            <w:r>
+              <w:rPr>
+                <w:sz w:val="18"/>
+              </w:rPr>
+              <w:t>1500</w:t>
+            </w:r>
+          </w:p>
+        </w:tc>
+      </w:tr>
+    </w:tbl>
+    <w:p>
+      <w:r>
+        <w:rPr>
+          <w:b/>
+        </w:rPr>
+        <w:t>Reach rate</w:t>
+      </w:r>
+      <w:r>
+        <w:t xml:space="preserve"> is the fraction of splits whose achieved recall met the target; the oracle budget is what the test split actually needs.</w:t>
+      </w:r>
+    </w:p>
+    <w:p>
+      <w:pPr>
+        <w:jc w:val="center"/>
+      </w:pPr>
+      <w:r>
+        <w:drawing>
+          <wp:inline xmlns:a="http://schemas.openxmlformats.org/drawingml/2006/main" xmlns:pic="http://schemas.openxmlformats.org/drawingml/2006/picture">
+            <wp:extent cx="5120640" cy="1822601"/>
+            <wp:docPr id="4" name="Picture 4"/>
+            <wp:cNvGraphicFramePr>
+              <a:graphicFrameLocks noChangeAspect="1"/>
+            </wp:cNvGraphicFramePr>
+            <a:graphic>
+              <a:graphicData uri="http://schemas.openxmlformats.org/drawingml/2006/picture">
+                <pic:pic>
+                  <pic:nvPicPr>
+                    <pic:cNvPr id="0" name="fig4-calibration.png"/>
+                    <pic:cNvPicPr/>
+                  </pic:nvPicPr>
+                  <pic:blipFill>
+                    <a:blip r:embed="rId12"/>
+                    <a:stretch>
+                      <a:fillRect/>
+                    </a:stretch>
+                  </pic:blipFill>
+                  <pic:spPr>
+                    <a:xfrm>
+                      <a:off x="0" y="0"/>
+                      <a:ext cx="5120640" cy="1822601"/>
+                    </a:xfrm>
+                    <a:prstGeom prst="rect"/>
+                  </pic:spPr>
+                </pic:pic>
+              </a:graphicData>
+            </a:graphic>
+          </wp:inline>
+        </w:drawing>
+      </w:r>
+    </w:p>
+    <w:p>
+      <w:r>
+        <w:rPr>
+          <w:b/>
+        </w:rPr>
+        <w:t>Figure 4.</w:t>
+      </w:r>
+      <w:r>
+        <w:t xml:space="preserve"> (A) Recall against context budget for four retrievers on the 143-question benchmark; the dashed lines mark the 0.80, 0.85 and 0.90 targets used by the calibration protocol. (B) Reach rate against the safety margin for the hybrid retriever.</w:t>
+      </w:r>
+    </w:p>
+    <w:p>
+      <w:r>
+        <w:t>Three findings follow. First, on the strongest retriever twenty labelled questions suffice: the predicted budget lands within 1.1-1.6x of the oracle and the target is met 76-93% of the time. Second, calibration is retriever-specific: swapping bge-m3 for bge-large-en widens the prediction error and drops the reach rate for the 0.85 target from 0.83 to 0.33, so a change of retriever requires recalibration. Third, the protocol must refuse unreachable targets: BM25 never exceeds about 0.85 recall on this corpus at any sampled budget, and a calibration that returned a number anyway would be a promise the system cannot keep.</w:t>
+      </w:r>
+    </w:p>
+    <w:p>
+      <w:pPr>
+        <w:pStyle w:val="Heading2"/>
+      </w:pPr>
+      <w:r>
+        <w:t>6.11 Why a Second Budget Does Not Bind</w:t>
+      </w:r>
+    </w:p>
+    <w:p>
+      <w:r>
+        <w:t>Real systems are constrained by tokens, latency and money at once, so one may ask whether a scalar budget is an oversimplification. We measured the retrieval side directly on the 143-question benchmark: BM25 takes 16 ms, dense retrieval 42 ms (including query encoding) and hybrid retrieval 69 ms, while generation takes 898 ms at p50 (Section 6.8). Retrieval therefore accounts for at most 7.2% of end-to-end latency, and the three cost dimensions are collinear in this setting: money is a fixed multiple of tokens, prefill latency is close to linear in context length, and the spread across retrievers (16-70 ms) is too small to move a latency budget.</w:t>
+      </w:r>
+    </w:p>
+    <w:p>
+      <w:r>
+        <w:t>The only action with a distinct cost vector is query rewriting, which adds both tokens and about 870 ms of latency. On this corpus it also lowers recall (0.902 against 0.937), so it is dominated in every two-dimensional budget. A second dimension would only bind when a component carries a different cost shape: per-call web search fees, routing between models of different price and quality, or an end-to-end latency SLA tight enough to exclude rewriting outright. The scalar budget is therefore not a simplification of the problem but the correct model for this operating regime, and we state the conditions under which it would have to be extended.</w:t>
       </w:r>
     </w:p>
     <w:p>

</xml_diff>

<commit_message>
polish: §7.1 的 First 与 Second/Third 平行成段
</commit_message>
<xml_diff>
--- a/docs/paper-en.docx
+++ b/docs/paper-en.docx
@@ -8569,7 +8569,12 @@
     </w:p>
     <w:p>
       <w:r>
-        <w:t>The strongest transferable finding is narrower than the original framing. On 312 documentation pages and BEIR scifact, truncating by tokens buys nothing over a well-chosen fixed $k$ (294 versus 318 tokens at equal recall). What does transfer is deciding the depth per query from the retrieval-score margin: at equal hit rate that saves 1-24% of context on natural corpora, and nothing on an adversarial one (Section 6.9). The mechanism is therefore "how many chunks does *this* query need", not "stop at a token count". First, the shadow price becomes a readable configuration value: $\lambda$ is the quality obtained per additional unit of budget, and it translates "how many chunks" into "is this unit still worth it". Section 6.7 shows the observable consequence—when the unit-price coefficient rises from 0.25 to 2, the optimal threshold falls from 0.25 to 0 and the system decides by itself that rewriting is not worth it at that price. A budget can therefore be written into configuration as an SLA (tokens and money per query) and survives a change of model or price without re-sweeping hyperparameters.</w:t>
+        <w:t>The strongest transferable finding is narrower than the original framing. On 312 documentation pages and BEIR scifact, truncating by tokens buys nothing over a well-chosen fixed $k$ (294 versus 318 tokens at equal recall). What does transfer is deciding the depth per query from the retrieval-score margin: at equal hit rate that saves 1-24% of context on natural corpora, and nothing on an adversarial one (Section 6.9). The mechanism is therefore "how many chunks does *this* query need", not "stop at a token count".</w:t>
+      </w:r>
+    </w:p>
+    <w:p>
+      <w:r>
+        <w:t>First, the shadow price becomes a readable configuration value: $\lambda$ is the quality obtained per additional unit of budget, and it translates "how many chunks" into "is this unit still worth it". Section 6.7 shows the observable consequence—when the unit-price coefficient rises from 0.25 to 2, the optimal threshold falls from 0.25 to 0 and the system decides by itself that rewriting is not worth it at that price. A budget can therefore be written into configuration as an SLA (tokens and money per query) and survives a change of model or price without re-sweeping hyperparameters.</w:t>
       </w:r>
     </w:p>
     <w:p>

</xml_diff>

<commit_message>
fix(6.11-6.18): 表 10/11 同名不同物（Hybrid budget300 vs fixed k8）、6.12 毛/净收益、6.14 归因软化、表 12 指标 recall、标题对齐
</commit_message>
<xml_diff>
--- a/docs/paper-en.docx
+++ b/docs/paper-en.docx
@@ -6859,7 +6859,7 @@
               <w:rPr>
                 <w:sz w:val="18"/>
               </w:rPr>
-              <w:t>Hybrid top-8</w:t>
+              <w:t>Hybrid (budget 300)</w:t>
             </w:r>
           </w:p>
         </w:tc>
@@ -6971,7 +6971,7 @@
         <w:t>2.15 ms per token</w:t>
       </w:r>
       <w:r>
-        <w:t xml:space="preserve"> on CPU. The net gain from swapping to the stronger retriever is then 467 ms at a 0.80 target and 2258 ms at 0.90, against 58 ms of extra retrieval.</w:t>
+        <w:t xml:space="preserve"> on CPU. The gross prefill saving from swapping to the stronger retriever is 467 ms at a 0.80 target and 2258 ms at 0.90; after the 58 ms of extra retrieval the net gains are about 409 ms and 2200 ms.</w:t>
       </w:r>
     </w:p>
     <w:p>
@@ -6984,7 +6984,7 @@
         <w:pStyle w:val="Heading2"/>
       </w:pPr>
       <w:r>
-        <w:t>6.13 How the Questions Were Written, and How Much They Overlap the Sources</w:t>
+        <w:t>6.13 Question-Source Overlap</w:t>
       </w:r>
     </w:p>
     <w:p>
@@ -7020,7 +7020,7 @@
         <w:pStyle w:val="Heading2"/>
       </w:pPr>
       <w:r>
-        <w:t>6.14 Where the Errors Come From</w:t>
+        <w:t>6.14 Error Patterns across Retrieval and Generation</w:t>
       </w:r>
     </w:p>
     <w:p>
@@ -7048,7 +7048,7 @@
         <w:t>wrong-entity substitutions</w:t>
       </w:r>
       <w:r>
-        <w:t xml:space="preserve"> rather than refusals. For example the comparison question "which case was brought first, Miller v. California or Gates v. Collier" is answered with the second case, and "where was the wife of Francis I Rakoczi born" is answered with the place she lived. Retrieval hit the answer span 0.51-0.69 of the time while accuracy was 0.14-0.52, so roughly half of the remaining gap is lost on the generation side, not in retrieval.</w:t>
+        <w:t xml:space="preserve"> rather than refusals. For example the comparison question "which case was brought first, Miller v. California or Gates v. Collier" is answered with the second case, and "where was the wife of Francis I Rakoczi born" is answered with the place she lived. Retrieval hit the answer span 0.51-0.69 of the time while accuracy was 0.14-0.52. The two rates differ, but this aggregate comparison does not identify what fraction of the gap arises during generation.</w:t>
       </w:r>
     </w:p>
     <w:p>
@@ -7459,7 +7459,7 @@
               <w:rPr>
                 <w:sz w:val="18"/>
               </w:rPr>
-              <w:t>Hybrid top-8</w:t>
+              <w:t>Fixed k = 8 (hybrid)</w:t>
             </w:r>
           </w:p>
         </w:tc>
@@ -7511,7 +7511,7 @@
         <w:pStyle w:val="Heading2"/>
       </w:pPr>
       <w:r>
-        <w:t>6.17 Per-Query Thresholds: Tested, No Gain</w:t>
+        <w:t>6.17 Per-Query Thresholds: No Better Trade-off</w:t>
       </w:r>
     </w:p>
     <w:p>
@@ -7527,7 +7527,7 @@
         <w:t>Table 12.</w:t>
       </w:r>
       <w:r>
-        <w:t xml:space="preserve"> Per-query threshold sweep: nDCG@10, tokens and saving against fixed k = 8. Table 12 reports the sweep.</w:t>
+        <w:t xml:space="preserve"> Per-query threshold sweep on the internal benchmark: recall, tokens and saving against fixed k = 8. Table 12 reports the sweep.</w:t>
       </w:r>
     </w:p>
     <w:tbl>
@@ -8021,7 +8021,7 @@
     </w:p>
     <w:p>
       <w:r>
-        <w:t>The reason is visible in the definition: hybrid scores are already normalised per query, so the absolute gap (s1 - s2)/s1 is a comparable statistic across queries, while the *incremental* drop between adjacent chunks adds noise -- one flat pair of scores is enough to trigger or suppress a cut. We therefore keep the global threshold and report the per-query variant as a negative result; the recalibration cost stays a stated limitation rather than being papered over by a rule that does not work.</w:t>
+        <w:t>A plausible explanation is that the normalised gap between the top two scores is comparable across queries, whereas a single flat pair of adjacent scores can move the per-query stopping point. The sweep establishes the trade-off but does not test this explanation directly. We therefore keep the global threshold and report the per-query variant as a negative result; the recalibration cost stays a stated limitation rather than being papered over by a rule that does not work.</w:t>
       </w:r>
     </w:p>
     <w:p>

</xml_diff>